<commit_message>
Added legal issues to report
</commit_message>
<xml_diff>
--- a/ECAD2023Oct_Assignment_2_CoverPage.docx
+++ b/ECAD2023Oct_Assignment_2_CoverPage.docx
@@ -1536,13 +1536,7 @@
               <w:rPr>
                 <w:rStyle w:val="ui-provider"/>
               </w:rPr>
-              <w:t xml:space="preserve">Owen Wong </w:t>
-            </w:r>
-            <w:r>
-              <w:rPr>
-                <w:rStyle w:val="ui-provider"/>
-              </w:rPr>
-              <w:t>Hoi Yang</w:t>
+              <w:t>Owen Wong Hoi Yang</w:t>
             </w:r>
           </w:p>
         </w:tc>
@@ -1848,6 +1842,12 @@
     </w:p>
     <w:sdt>
       <w:sdtPr>
+        <w:rPr>
+          <w:rFonts w:ascii="Times New Roman" w:eastAsia="SimSun" w:hAnsi="Times New Roman" w:cs="Times New Roman"/>
+          <w:color w:val="auto"/>
+          <w:sz w:val="24"/>
+          <w:szCs w:val="24"/>
+        </w:rPr>
         <w:id w:val="-373697667"/>
         <w:docPartObj>
           <w:docPartGallery w:val="Table of Contents"/>
@@ -1856,13 +1856,9 @@
       </w:sdtPr>
       <w:sdtEndPr>
         <w:rPr>
-          <w:rFonts w:ascii="Times New Roman" w:eastAsia="宋体" w:hAnsi="Times New Roman" w:cs="Times New Roman"/>
           <w:b/>
           <w:bCs/>
           <w:noProof/>
-          <w:color w:val="auto"/>
-          <w:sz w:val="24"/>
-          <w:szCs w:val="24"/>
         </w:rPr>
       </w:sdtEndPr>
       <w:sdtContent>
@@ -1911,7 +1907,7 @@
           <w:r>
             <w:fldChar w:fldCharType="separate"/>
           </w:r>
-          <w:hyperlink w:anchor="_Toc157522186" w:history="1">
+          <w:hyperlink w:anchor="_Toc157533343" w:history="1">
             <w:r>
               <w:rPr>
                 <w:rStyle w:val="Hyperlink"/>
@@ -1939,7 +1935,7 @@
                 <w:noProof/>
                 <w:webHidden/>
               </w:rPr>
-              <w:instrText xml:space="preserve"> PAGEREF _Toc157522186 \h </w:instrText>
+              <w:instrText xml:space="preserve"> PAGEREF _Toc157533343 \h </w:instrText>
             </w:r>
             <w:r>
               <w:rPr>
@@ -1986,15 +1982,11 @@
               <w14:ligatures w14:val="standardContextual"/>
             </w:rPr>
           </w:pPr>
-          <w:hyperlink w:anchor="_Toc157522187" w:history="1">
+          <w:hyperlink w:anchor="_Toc157533344" w:history="1">
             <w:r>
               <w:rPr>
                 <w:rStyle w:val="Hyperlink"/>
-                <w:rFonts w:asciiTheme="majorHAnsi" w:hAnsiTheme="majorHAnsi" w:cstheme="majorHAnsi"/>
-                <w:b/>
-                <w:bCs/>
-                <w:noProof/>
-                <w:lang w:val="en-GB"/>
+                <w:noProof/>
               </w:rPr>
               <w:t>1.1. Market Analysis:</w:t>
             </w:r>
@@ -2017,7 +2009,7 @@
                 <w:noProof/>
                 <w:webHidden/>
               </w:rPr>
-              <w:instrText xml:space="preserve"> PAGEREF _Toc157522187 \h </w:instrText>
+              <w:instrText xml:space="preserve"> PAGEREF _Toc157533344 \h </w:instrText>
             </w:r>
             <w:r>
               <w:rPr>
@@ -2064,15 +2056,11 @@
               <w14:ligatures w14:val="standardContextual"/>
             </w:rPr>
           </w:pPr>
-          <w:hyperlink w:anchor="_Toc157522188" w:history="1">
+          <w:hyperlink w:anchor="_Toc157533345" w:history="1">
             <w:r>
               <w:rPr>
                 <w:rStyle w:val="Hyperlink"/>
-                <w:rFonts w:asciiTheme="majorHAnsi" w:hAnsiTheme="majorHAnsi" w:cstheme="majorHAnsi"/>
-                <w:b/>
-                <w:bCs/>
-                <w:noProof/>
-                <w:lang w:val="en-GB"/>
+                <w:noProof/>
               </w:rPr>
               <w:t>1.2. Marketing Strategies:</w:t>
             </w:r>
@@ -2095,7 +2083,7 @@
                 <w:noProof/>
                 <w:webHidden/>
               </w:rPr>
-              <w:instrText xml:space="preserve"> PAGEREF _Toc157522188 \h </w:instrText>
+              <w:instrText xml:space="preserve"> PAGEREF _Toc157533345 \h </w:instrText>
             </w:r>
             <w:r>
               <w:rPr>
@@ -2142,14 +2130,14 @@
               <w14:ligatures w14:val="standardContextual"/>
             </w:rPr>
           </w:pPr>
-          <w:hyperlink w:anchor="_Toc157522189" w:history="1">
+          <w:hyperlink w:anchor="_Toc157533346" w:history="1">
             <w:r>
               <w:rPr>
                 <w:rStyle w:val="Hyperlink"/>
                 <w:rFonts w:asciiTheme="majorHAnsi" w:hAnsiTheme="majorHAnsi" w:cstheme="majorHAnsi"/>
                 <w:noProof/>
               </w:rPr>
-              <w:t>2. Legal Issues faced</w:t>
+              <w:t>2. Legal Issues Faced</w:t>
             </w:r>
             <w:r>
               <w:rPr>
@@ -2170,7 +2158,7 @@
                 <w:noProof/>
                 <w:webHidden/>
               </w:rPr>
-              <w:instrText xml:space="preserve"> PAGEREF _Toc157522189 \h </w:instrText>
+              <w:instrText xml:space="preserve"> PAGEREF _Toc157533346 \h </w:instrText>
             </w:r>
             <w:r>
               <w:rPr>
@@ -2191,6 +2179,460 @@
                 <w:webHidden/>
               </w:rPr>
               <w:t>5</w:t>
+            </w:r>
+            <w:r>
+              <w:rPr>
+                <w:noProof/>
+                <w:webHidden/>
+              </w:rPr>
+              <w:fldChar w:fldCharType="end"/>
+            </w:r>
+          </w:hyperlink>
+        </w:p>
+        <w:p>
+          <w:pPr>
+            <w:pStyle w:val="TOC2"/>
+            <w:tabs>
+              <w:tab w:val="right" w:leader="dot" w:pos="8299"/>
+            </w:tabs>
+            <w:rPr>
+              <w:rFonts w:asciiTheme="minorHAnsi" w:eastAsiaTheme="minorEastAsia" w:hAnsiTheme="minorHAnsi" w:cstheme="minorBidi"/>
+              <w:noProof/>
+              <w:kern w:val="2"/>
+              <w:sz w:val="22"/>
+              <w:szCs w:val="22"/>
+              <w:lang w:val="en-SG" w:eastAsia="zh-CN"/>
+              <w14:ligatures w14:val="standardContextual"/>
+            </w:rPr>
+          </w:pPr>
+          <w:hyperlink w:anchor="_Toc157533347" w:history="1">
+            <w:r>
+              <w:rPr>
+                <w:rStyle w:val="Hyperlink"/>
+                <w:b/>
+                <w:bCs/>
+                <w:noProof/>
+              </w:rPr>
+              <w:t>2.1 Data Privacy and Protection</w:t>
+            </w:r>
+            <w:r>
+              <w:rPr>
+                <w:noProof/>
+                <w:webHidden/>
+              </w:rPr>
+              <w:tab/>
+            </w:r>
+            <w:r>
+              <w:rPr>
+                <w:noProof/>
+                <w:webHidden/>
+              </w:rPr>
+              <w:fldChar w:fldCharType="begin"/>
+            </w:r>
+            <w:r>
+              <w:rPr>
+                <w:noProof/>
+                <w:webHidden/>
+              </w:rPr>
+              <w:instrText xml:space="preserve"> PAGEREF _Toc157533347 \h </w:instrText>
+            </w:r>
+            <w:r>
+              <w:rPr>
+                <w:noProof/>
+                <w:webHidden/>
+              </w:rPr>
+            </w:r>
+            <w:r>
+              <w:rPr>
+                <w:noProof/>
+                <w:webHidden/>
+              </w:rPr>
+              <w:fldChar w:fldCharType="separate"/>
+            </w:r>
+            <w:r>
+              <w:rPr>
+                <w:noProof/>
+                <w:webHidden/>
+              </w:rPr>
+              <w:t>5</w:t>
+            </w:r>
+            <w:r>
+              <w:rPr>
+                <w:noProof/>
+                <w:webHidden/>
+              </w:rPr>
+              <w:fldChar w:fldCharType="end"/>
+            </w:r>
+          </w:hyperlink>
+        </w:p>
+        <w:p>
+          <w:pPr>
+            <w:pStyle w:val="TOC2"/>
+            <w:tabs>
+              <w:tab w:val="right" w:leader="dot" w:pos="8299"/>
+            </w:tabs>
+            <w:rPr>
+              <w:rFonts w:asciiTheme="minorHAnsi" w:eastAsiaTheme="minorEastAsia" w:hAnsiTheme="minorHAnsi" w:cstheme="minorBidi"/>
+              <w:noProof/>
+              <w:kern w:val="2"/>
+              <w:sz w:val="22"/>
+              <w:szCs w:val="22"/>
+              <w:lang w:val="en-SG" w:eastAsia="zh-CN"/>
+              <w14:ligatures w14:val="standardContextual"/>
+            </w:rPr>
+          </w:pPr>
+          <w:hyperlink w:anchor="_Toc157533348" w:history="1">
+            <w:r>
+              <w:rPr>
+                <w:rStyle w:val="Hyperlink"/>
+                <w:b/>
+                <w:bCs/>
+                <w:noProof/>
+              </w:rPr>
+              <w:t>2.2 Intellectual Property Rights</w:t>
+            </w:r>
+            <w:r>
+              <w:rPr>
+                <w:noProof/>
+                <w:webHidden/>
+              </w:rPr>
+              <w:tab/>
+            </w:r>
+            <w:r>
+              <w:rPr>
+                <w:noProof/>
+                <w:webHidden/>
+              </w:rPr>
+              <w:fldChar w:fldCharType="begin"/>
+            </w:r>
+            <w:r>
+              <w:rPr>
+                <w:noProof/>
+                <w:webHidden/>
+              </w:rPr>
+              <w:instrText xml:space="preserve"> PAGEREF _Toc157533348 \h </w:instrText>
+            </w:r>
+            <w:r>
+              <w:rPr>
+                <w:noProof/>
+                <w:webHidden/>
+              </w:rPr>
+            </w:r>
+            <w:r>
+              <w:rPr>
+                <w:noProof/>
+                <w:webHidden/>
+              </w:rPr>
+              <w:fldChar w:fldCharType="separate"/>
+            </w:r>
+            <w:r>
+              <w:rPr>
+                <w:noProof/>
+                <w:webHidden/>
+              </w:rPr>
+              <w:t>5</w:t>
+            </w:r>
+            <w:r>
+              <w:rPr>
+                <w:noProof/>
+                <w:webHidden/>
+              </w:rPr>
+              <w:fldChar w:fldCharType="end"/>
+            </w:r>
+          </w:hyperlink>
+        </w:p>
+        <w:p>
+          <w:pPr>
+            <w:pStyle w:val="TOC2"/>
+            <w:tabs>
+              <w:tab w:val="right" w:leader="dot" w:pos="8299"/>
+            </w:tabs>
+            <w:rPr>
+              <w:rFonts w:asciiTheme="minorHAnsi" w:eastAsiaTheme="minorEastAsia" w:hAnsiTheme="minorHAnsi" w:cstheme="minorBidi"/>
+              <w:noProof/>
+              <w:kern w:val="2"/>
+              <w:sz w:val="22"/>
+              <w:szCs w:val="22"/>
+              <w:lang w:val="en-SG" w:eastAsia="zh-CN"/>
+              <w14:ligatures w14:val="standardContextual"/>
+            </w:rPr>
+          </w:pPr>
+          <w:hyperlink w:anchor="_Toc157533349" w:history="1">
+            <w:r>
+              <w:rPr>
+                <w:rStyle w:val="Hyperlink"/>
+                <w:b/>
+                <w:bCs/>
+                <w:noProof/>
+              </w:rPr>
+              <w:t>2.3 Consumer Protection Laws</w:t>
+            </w:r>
+            <w:r>
+              <w:rPr>
+                <w:noProof/>
+                <w:webHidden/>
+              </w:rPr>
+              <w:tab/>
+            </w:r>
+            <w:r>
+              <w:rPr>
+                <w:noProof/>
+                <w:webHidden/>
+              </w:rPr>
+              <w:fldChar w:fldCharType="begin"/>
+            </w:r>
+            <w:r>
+              <w:rPr>
+                <w:noProof/>
+                <w:webHidden/>
+              </w:rPr>
+              <w:instrText xml:space="preserve"> PAGEREF _Toc157533349 \h </w:instrText>
+            </w:r>
+            <w:r>
+              <w:rPr>
+                <w:noProof/>
+                <w:webHidden/>
+              </w:rPr>
+            </w:r>
+            <w:r>
+              <w:rPr>
+                <w:noProof/>
+                <w:webHidden/>
+              </w:rPr>
+              <w:fldChar w:fldCharType="separate"/>
+            </w:r>
+            <w:r>
+              <w:rPr>
+                <w:noProof/>
+                <w:webHidden/>
+              </w:rPr>
+              <w:t>5</w:t>
+            </w:r>
+            <w:r>
+              <w:rPr>
+                <w:noProof/>
+                <w:webHidden/>
+              </w:rPr>
+              <w:fldChar w:fldCharType="end"/>
+            </w:r>
+          </w:hyperlink>
+        </w:p>
+        <w:p>
+          <w:pPr>
+            <w:pStyle w:val="TOC2"/>
+            <w:tabs>
+              <w:tab w:val="right" w:leader="dot" w:pos="8299"/>
+            </w:tabs>
+            <w:rPr>
+              <w:rFonts w:asciiTheme="minorHAnsi" w:eastAsiaTheme="minorEastAsia" w:hAnsiTheme="minorHAnsi" w:cstheme="minorBidi"/>
+              <w:noProof/>
+              <w:kern w:val="2"/>
+              <w:sz w:val="22"/>
+              <w:szCs w:val="22"/>
+              <w:lang w:val="en-SG" w:eastAsia="zh-CN"/>
+              <w14:ligatures w14:val="standardContextual"/>
+            </w:rPr>
+          </w:pPr>
+          <w:hyperlink w:anchor="_Toc157533350" w:history="1">
+            <w:r>
+              <w:rPr>
+                <w:rStyle w:val="Hyperlink"/>
+                <w:b/>
+                <w:bCs/>
+                <w:noProof/>
+              </w:rPr>
+              <w:t>2.4 Solutions and Recommendations</w:t>
+            </w:r>
+            <w:r>
+              <w:rPr>
+                <w:noProof/>
+                <w:webHidden/>
+              </w:rPr>
+              <w:tab/>
+            </w:r>
+            <w:r>
+              <w:rPr>
+                <w:noProof/>
+                <w:webHidden/>
+              </w:rPr>
+              <w:fldChar w:fldCharType="begin"/>
+            </w:r>
+            <w:r>
+              <w:rPr>
+                <w:noProof/>
+                <w:webHidden/>
+              </w:rPr>
+              <w:instrText xml:space="preserve"> PAGEREF _Toc157533350 \h </w:instrText>
+            </w:r>
+            <w:r>
+              <w:rPr>
+                <w:noProof/>
+                <w:webHidden/>
+              </w:rPr>
+            </w:r>
+            <w:r>
+              <w:rPr>
+                <w:noProof/>
+                <w:webHidden/>
+              </w:rPr>
+              <w:fldChar w:fldCharType="separate"/>
+            </w:r>
+            <w:r>
+              <w:rPr>
+                <w:noProof/>
+                <w:webHidden/>
+              </w:rPr>
+              <w:t>5</w:t>
+            </w:r>
+            <w:r>
+              <w:rPr>
+                <w:noProof/>
+                <w:webHidden/>
+              </w:rPr>
+              <w:fldChar w:fldCharType="end"/>
+            </w:r>
+          </w:hyperlink>
+        </w:p>
+        <w:p>
+          <w:pPr>
+            <w:pStyle w:val="TOC1"/>
+            <w:tabs>
+              <w:tab w:val="right" w:leader="dot" w:pos="8299"/>
+            </w:tabs>
+            <w:rPr>
+              <w:rFonts w:asciiTheme="minorHAnsi" w:eastAsiaTheme="minorEastAsia" w:hAnsiTheme="minorHAnsi" w:cstheme="minorBidi"/>
+              <w:noProof/>
+              <w:kern w:val="2"/>
+              <w:sz w:val="22"/>
+              <w:szCs w:val="22"/>
+              <w:lang w:val="en-SG" w:eastAsia="zh-CN"/>
+              <w14:ligatures w14:val="standardContextual"/>
+            </w:rPr>
+          </w:pPr>
+          <w:hyperlink w:anchor="_Toc157533351" w:history="1">
+            <w:r>
+              <w:rPr>
+                <w:rStyle w:val="Hyperlink"/>
+                <w:rFonts w:asciiTheme="majorHAnsi" w:hAnsiTheme="majorHAnsi" w:cstheme="majorHAnsi"/>
+                <w:noProof/>
+              </w:rPr>
+              <w:t>3. Personalization Service to the Shoppers</w:t>
+            </w:r>
+            <w:r>
+              <w:rPr>
+                <w:noProof/>
+                <w:webHidden/>
+              </w:rPr>
+              <w:tab/>
+            </w:r>
+            <w:r>
+              <w:rPr>
+                <w:noProof/>
+                <w:webHidden/>
+              </w:rPr>
+              <w:fldChar w:fldCharType="begin"/>
+            </w:r>
+            <w:r>
+              <w:rPr>
+                <w:noProof/>
+                <w:webHidden/>
+              </w:rPr>
+              <w:instrText xml:space="preserve"> PAGEREF _Toc157533351 \h </w:instrText>
+            </w:r>
+            <w:r>
+              <w:rPr>
+                <w:noProof/>
+                <w:webHidden/>
+              </w:rPr>
+            </w:r>
+            <w:r>
+              <w:rPr>
+                <w:noProof/>
+                <w:webHidden/>
+              </w:rPr>
+              <w:fldChar w:fldCharType="separate"/>
+            </w:r>
+            <w:r>
+              <w:rPr>
+                <w:noProof/>
+                <w:webHidden/>
+              </w:rPr>
+              <w:t>6</w:t>
+            </w:r>
+            <w:r>
+              <w:rPr>
+                <w:noProof/>
+                <w:webHidden/>
+              </w:rPr>
+              <w:fldChar w:fldCharType="end"/>
+            </w:r>
+          </w:hyperlink>
+        </w:p>
+        <w:p>
+          <w:pPr>
+            <w:pStyle w:val="TOC1"/>
+            <w:tabs>
+              <w:tab w:val="right" w:leader="dot" w:pos="8299"/>
+            </w:tabs>
+            <w:rPr>
+              <w:rFonts w:asciiTheme="minorHAnsi" w:eastAsiaTheme="minorEastAsia" w:hAnsiTheme="minorHAnsi" w:cstheme="minorBidi"/>
+              <w:noProof/>
+              <w:kern w:val="2"/>
+              <w:sz w:val="22"/>
+              <w:szCs w:val="22"/>
+              <w:lang w:val="en-SG" w:eastAsia="zh-CN"/>
+              <w14:ligatures w14:val="standardContextual"/>
+            </w:rPr>
+          </w:pPr>
+          <w:hyperlink w:anchor="_Toc157533352" w:history="1">
+            <w:r>
+              <w:rPr>
+                <w:rStyle w:val="Hyperlink"/>
+                <w:rFonts w:asciiTheme="majorHAnsi" w:hAnsiTheme="majorHAnsi" w:cstheme="majorHAnsi"/>
+                <w:noProof/>
+              </w:rPr>
+              <w:t>4. References</w:t>
+            </w:r>
+            <w:r>
+              <w:rPr>
+                <w:noProof/>
+                <w:webHidden/>
+              </w:rPr>
+              <w:tab/>
+            </w:r>
+            <w:r>
+              <w:rPr>
+                <w:noProof/>
+                <w:webHidden/>
+              </w:rPr>
+              <w:fldChar w:fldCharType="begin"/>
+            </w:r>
+            <w:r>
+              <w:rPr>
+                <w:noProof/>
+                <w:webHidden/>
+              </w:rPr>
+              <w:instrText xml:space="preserve"> PAGEREF _Toc157533352 \h </w:instrText>
+            </w:r>
+            <w:r>
+              <w:rPr>
+                <w:noProof/>
+                <w:webHidden/>
+              </w:rPr>
+            </w:r>
+            <w:r>
+              <w:rPr>
+                <w:noProof/>
+                <w:webHidden/>
+              </w:rPr>
+              <w:fldChar w:fldCharType="separate"/>
+            </w:r>
+            <w:r>
+              <w:rPr>
+                <w:noProof/>
+                <w:webHidden/>
+              </w:rPr>
+              <w:t>7</w:t>
             </w:r>
             <w:r>
               <w:rPr>
@@ -2250,7 +2692,7 @@
           <w:color w:val="4472C4" w:themeColor="accent1"/>
         </w:rPr>
       </w:pPr>
-      <w:bookmarkStart w:id="0" w:name="_Toc157522186"/>
+      <w:bookmarkStart w:id="0" w:name="_Toc157533343"/>
       <w:r>
         <w:rPr>
           <w:rFonts w:asciiTheme="majorHAnsi" w:hAnsiTheme="majorHAnsi" w:cstheme="majorHAnsi"/>
@@ -2264,24 +2706,9 @@
     <w:p>
       <w:pPr>
         <w:pStyle w:val="Heading2"/>
-        <w:spacing w:line="360" w:lineRule="auto"/>
-        <w:rPr>
-          <w:rFonts w:asciiTheme="majorHAnsi" w:hAnsiTheme="majorHAnsi" w:cstheme="majorHAnsi"/>
-          <w:b/>
-          <w:bCs/>
-          <w:color w:val="4472C4" w:themeColor="accent1"/>
-          <w:lang w:val="en-GB"/>
-        </w:rPr>
-      </w:pPr>
-      <w:bookmarkStart w:id="1" w:name="_Toc157522187"/>
-      <w:r>
-        <w:rPr>
-          <w:rFonts w:asciiTheme="majorHAnsi" w:hAnsiTheme="majorHAnsi" w:cstheme="majorHAnsi"/>
-          <w:b/>
-          <w:bCs/>
-          <w:color w:val="4472C4" w:themeColor="accent1"/>
-          <w:lang w:val="en-GB"/>
-        </w:rPr>
+      </w:pPr>
+      <w:bookmarkStart w:id="1" w:name="_Toc157533344"/>
+      <w:r>
         <w:t>1.1. Market Analysis:</w:t>
       </w:r>
       <w:bookmarkEnd w:id="1"/>
@@ -2362,6 +2789,7 @@
       <w:r>
         <w:rPr>
           <w:rFonts w:asciiTheme="minorHAnsi" w:hAnsiTheme="minorHAnsi" w:cstheme="minorHAnsi"/>
+          <w:noProof/>
         </w:rPr>
         <w:drawing>
           <wp:inline distT="0" distB="0" distL="0" distR="0" wp14:anchorId="4E4ECDB7" wp14:editId="668D7804">
@@ -2403,24 +2831,9 @@
     <w:p>
       <w:pPr>
         <w:pStyle w:val="Heading2"/>
-        <w:spacing w:line="360" w:lineRule="auto"/>
-        <w:rPr>
-          <w:rFonts w:asciiTheme="majorHAnsi" w:hAnsiTheme="majorHAnsi" w:cstheme="majorHAnsi"/>
-          <w:b/>
-          <w:bCs/>
-          <w:color w:val="4472C4" w:themeColor="accent1"/>
-          <w:lang w:val="en-GB"/>
-        </w:rPr>
-      </w:pPr>
-      <w:bookmarkStart w:id="2" w:name="_Toc157522188"/>
-      <w:r>
-        <w:rPr>
-          <w:rFonts w:asciiTheme="majorHAnsi" w:hAnsiTheme="majorHAnsi" w:cstheme="majorHAnsi"/>
-          <w:b/>
-          <w:bCs/>
-          <w:color w:val="4472C4" w:themeColor="accent1"/>
-          <w:lang w:val="en-GB"/>
-        </w:rPr>
+      </w:pPr>
+      <w:bookmarkStart w:id="2" w:name="_Toc157533345"/>
+      <w:r>
         <w:t>1.2. Marketing Strategies:</w:t>
       </w:r>
       <w:bookmarkEnd w:id="2"/>
@@ -2556,14 +2969,7 @@
         <w:rPr>
           <w:rFonts w:asciiTheme="minorHAnsi" w:hAnsiTheme="minorHAnsi" w:cstheme="minorHAnsi"/>
         </w:rPr>
-        <w:t xml:space="preserve"> and </w:t>
-      </w:r>
-      <w:r>
-        <w:rPr>
-          <w:rFonts w:asciiTheme="minorHAnsi" w:hAnsiTheme="minorHAnsi" w:cstheme="minorHAnsi"/>
-        </w:rPr>
-        <w:lastRenderedPageBreak/>
-        <w:t>crafting tailored messages.</w:t>
+        <w:t xml:space="preserve"> and crafting tailored messages.</w:t>
       </w:r>
       <w:r>
         <w:rPr>
@@ -2590,6 +2996,7 @@
           <w:bCs/>
           <w:lang w:val="en-GB"/>
         </w:rPr>
+        <w:lastRenderedPageBreak/>
         <w:t>2. Partnerships and Collaborations:</w:t>
       </w:r>
     </w:p>
@@ -2741,6 +3148,7 @@
       <w:r>
         <w:rPr>
           <w:rFonts w:asciiTheme="minorHAnsi" w:hAnsiTheme="minorHAnsi" w:cstheme="minorHAnsi"/>
+          <w:noProof/>
         </w:rPr>
         <w:drawing>
           <wp:inline distT="0" distB="0" distL="0" distR="0" wp14:anchorId="2850F0D6" wp14:editId="13D5BCC8">
@@ -2783,122 +3191,435 @@
       <w:pPr>
         <w:pStyle w:val="Heading1"/>
         <w:rPr>
+          <w:rStyle w:val="Strong"/>
+          <w:rFonts w:asciiTheme="majorHAnsi" w:hAnsiTheme="majorHAnsi" w:cstheme="majorHAnsi"/>
+          <w:b/>
+          <w:bCs/>
+          <w:color w:val="4472C4" w:themeColor="accent1"/>
+        </w:rPr>
+      </w:pPr>
+      <w:bookmarkStart w:id="3" w:name="_Toc157533346"/>
+      <w:r>
+        <w:rPr>
           <w:rFonts w:asciiTheme="majorHAnsi" w:hAnsiTheme="majorHAnsi" w:cstheme="majorHAnsi"/>
           <w:color w:val="4472C4" w:themeColor="accent1"/>
         </w:rPr>
-      </w:pPr>
-      <w:bookmarkStart w:id="3" w:name="_Toc157522189"/>
+        <w:lastRenderedPageBreak/>
+        <w:t xml:space="preserve">2. Legal Issues </w:t>
+      </w:r>
       <w:r>
         <w:rPr>
           <w:rFonts w:asciiTheme="majorHAnsi" w:hAnsiTheme="majorHAnsi" w:cstheme="majorHAnsi"/>
           <w:color w:val="4472C4" w:themeColor="accent1"/>
         </w:rPr>
-        <w:lastRenderedPageBreak/>
-        <w:t xml:space="preserve">2. Legal Issues </w:t>
+        <w:t>F</w:t>
       </w:r>
       <w:r>
         <w:rPr>
           <w:rFonts w:asciiTheme="majorHAnsi" w:hAnsiTheme="majorHAnsi" w:cstheme="majorHAnsi"/>
           <w:color w:val="4472C4" w:themeColor="accent1"/>
         </w:rPr>
-        <w:t>F</w:t>
-      </w:r>
-      <w:r>
-        <w:rPr>
-          <w:rFonts w:asciiTheme="majorHAnsi" w:hAnsiTheme="majorHAnsi" w:cstheme="majorHAnsi"/>
-          <w:color w:val="4472C4" w:themeColor="accent1"/>
-        </w:rPr>
         <w:t>aced</w:t>
       </w:r>
       <w:bookmarkEnd w:id="3"/>
     </w:p>
     <w:p>
       <w:pPr>
-        <w:pStyle w:val="NormalWeb"/>
-        <w:spacing w:line="360" w:lineRule="auto"/>
-        <w:rPr>
-          <w:rFonts w:asciiTheme="minorHAnsi" w:hAnsiTheme="minorHAnsi" w:cstheme="minorHAnsi"/>
-        </w:rPr>
-      </w:pPr>
-      <w:r>
         <w:rPr>
           <w:rStyle w:val="Strong"/>
-          <w:rFonts w:asciiTheme="minorHAnsi" w:hAnsiTheme="minorHAnsi" w:cstheme="minorHAnsi"/>
-        </w:rPr>
-        <w:t>Data Protection and Privacy:</w:t>
-      </w:r>
-      <w:r>
-        <w:rPr>
-          <w:rFonts w:asciiTheme="minorHAnsi" w:hAnsiTheme="minorHAnsi" w:cstheme="minorHAnsi"/>
-        </w:rPr>
-        <w:t xml:space="preserve"> E-commerce businesses must prioritize customer data protection. Compliance with laws like the GDPR involves explicit consent for data collection, robust data security measures, and transparency about data processing. This builds customer trust and avoids hefty fines.</w:t>
-      </w:r>
-    </w:p>
-    <w:p>
-      <w:pPr>
-        <w:pStyle w:val="NormalWeb"/>
-        <w:spacing w:line="360" w:lineRule="auto"/>
-        <w:rPr>
-          <w:rFonts w:asciiTheme="minorHAnsi" w:hAnsiTheme="minorHAnsi" w:cstheme="minorHAnsi"/>
+          <w:rFonts w:asciiTheme="minorHAnsi" w:eastAsia="Times New Roman" w:hAnsiTheme="minorHAnsi" w:cstheme="minorHAnsi"/>
+          <w:b w:val="0"/>
+          <w:bCs w:val="0"/>
+          <w:lang w:val="en-SG" w:eastAsia="zh-CN"/>
         </w:rPr>
       </w:pPr>
       <w:r>
         <w:rPr>
           <w:rStyle w:val="Strong"/>
-          <w:rFonts w:asciiTheme="minorHAnsi" w:hAnsiTheme="minorHAnsi" w:cstheme="minorHAnsi"/>
-        </w:rPr>
-        <w:t>Intellectual Property:</w:t>
-      </w:r>
-      <w:r>
-        <w:rPr>
-          <w:rFonts w:asciiTheme="minorHAnsi" w:hAnsiTheme="minorHAnsi" w:cstheme="minorHAnsi"/>
-        </w:rPr>
-        <w:t xml:space="preserve"> IP protection is crucial. E-commerce sites should respect copyrights and trademarks, avoid infringement, and protect their own intellectual assets to maintain integrity and competitive advantage.</w:t>
-      </w:r>
-    </w:p>
-    <w:p>
-      <w:pPr>
-        <w:pStyle w:val="NormalWeb"/>
-        <w:spacing w:line="360" w:lineRule="auto"/>
-        <w:rPr>
-          <w:rFonts w:asciiTheme="minorHAnsi" w:hAnsiTheme="minorHAnsi" w:cstheme="minorHAnsi"/>
-        </w:rPr>
-      </w:pPr>
-      <w:r>
+          <w:rFonts w:asciiTheme="minorHAnsi" w:eastAsia="Times New Roman" w:hAnsiTheme="minorHAnsi" w:cstheme="minorHAnsi"/>
+          <w:b w:val="0"/>
+          <w:bCs w:val="0"/>
+          <w:lang w:val="en-SG" w:eastAsia="zh-CN"/>
+        </w:rPr>
+        <w:t>E-commerce websites operate in a dynamic legal landscape where they must navigate various legal issues to ensure compliance and protect their business interests. Understanding these legal challenges is crucial for the sustainable operation of any online marketplace.</w:t>
+      </w:r>
+    </w:p>
+    <w:p>
+      <w:pPr>
         <w:rPr>
           <w:rStyle w:val="Strong"/>
-          <w:rFonts w:asciiTheme="minorHAnsi" w:hAnsiTheme="minorHAnsi" w:cstheme="minorHAnsi"/>
-        </w:rPr>
-        <w:t>Consumer Rights:</w:t>
-      </w:r>
-      <w:r>
-        <w:rPr>
-          <w:rFonts w:asciiTheme="minorHAnsi" w:hAnsiTheme="minorHAnsi" w:cstheme="minorHAnsi"/>
-        </w:rPr>
-        <w:t xml:space="preserve"> Adhering to consumer rights laws is mandatory. Clear policies on returns, refunds, and warranties not only comply with legal standards but also enhance customer satisfaction and loyalty.</w:t>
-      </w:r>
-    </w:p>
-    <w:p>
-      <w:pPr>
-        <w:pStyle w:val="NormalWeb"/>
-        <w:spacing w:line="360" w:lineRule="auto"/>
-        <w:rPr>
-          <w:rFonts w:asciiTheme="minorHAnsi" w:hAnsiTheme="minorHAnsi" w:cstheme="minorHAnsi"/>
-        </w:rPr>
-      </w:pPr>
-      <w:r>
+          <w:rFonts w:asciiTheme="minorHAnsi" w:eastAsia="Times New Roman" w:hAnsiTheme="minorHAnsi" w:cstheme="minorHAnsi"/>
+          <w:b w:val="0"/>
+          <w:bCs w:val="0"/>
+          <w:lang w:val="en-SG" w:eastAsia="zh-CN"/>
+        </w:rPr>
+      </w:pPr>
+    </w:p>
+    <w:p>
+      <w:pPr>
         <w:rPr>
           <w:rStyle w:val="Strong"/>
-          <w:rFonts w:asciiTheme="minorHAnsi" w:hAnsiTheme="minorHAnsi" w:cstheme="minorHAnsi"/>
-        </w:rPr>
-        <w:t>Risk Mitigation Strategies:</w:t>
-      </w:r>
-      <w:r>
-        <w:rPr>
-          <w:rFonts w:asciiTheme="minorHAnsi" w:hAnsiTheme="minorHAnsi" w:cstheme="minorHAnsi"/>
-        </w:rPr>
-        <w:t xml:space="preserve"> Implementing a compliance checklist, conducting regular legal audits, training staff on legal standards, and consulting with legal experts are effective strategies to mitigate legal risks.</w:t>
-      </w:r>
+          <w:rFonts w:asciiTheme="minorHAnsi" w:eastAsia="Times New Roman" w:hAnsiTheme="minorHAnsi" w:cstheme="minorHAnsi"/>
+          <w:b w:val="0"/>
+          <w:bCs w:val="0"/>
+          <w:lang w:val="en-SG" w:eastAsia="zh-CN"/>
+        </w:rPr>
+      </w:pPr>
+      <w:r>
+        <w:rPr>
+          <w:noProof/>
+        </w:rPr>
+        <w:drawing>
+          <wp:inline distT="0" distB="0" distL="0" distR="0" wp14:anchorId="18565C39" wp14:editId="09E4FE0F">
+            <wp:extent cx="5276215" cy="3899535"/>
+            <wp:effectExtent l="0" t="0" r="635" b="5715"/>
+            <wp:docPr id="904553181" name="Picture 1" descr="Legal Aspects of ECommerce - Part I | Transfer pricing | M&amp;A Critique"/>
+            <wp:cNvGraphicFramePr>
+              <a:graphicFrameLocks xmlns:a="http://schemas.openxmlformats.org/drawingml/2006/main" noChangeAspect="1"/>
+            </wp:cNvGraphicFramePr>
+            <a:graphic xmlns:a="http://schemas.openxmlformats.org/drawingml/2006/main">
+              <a:graphicData uri="http://schemas.openxmlformats.org/drawingml/2006/picture">
+                <pic:pic xmlns:pic="http://schemas.openxmlformats.org/drawingml/2006/picture">
+                  <pic:nvPicPr>
+                    <pic:cNvPr id="0" name="Picture 1" descr="Legal Aspects of ECommerce - Part I | Transfer pricing | M&amp;A Critique"/>
+                    <pic:cNvPicPr>
+                      <a:picLocks noChangeAspect="1" noChangeArrowheads="1"/>
+                    </pic:cNvPicPr>
+                  </pic:nvPicPr>
+                  <pic:blipFill>
+                    <a:blip r:embed="rId11">
+                      <a:extLst>
+                        <a:ext uri="{28A0092B-C50C-407E-A947-70E740481C1C}">
+                          <a14:useLocalDpi xmlns:a14="http://schemas.microsoft.com/office/drawing/2010/main" val="0"/>
+                        </a:ext>
+                      </a:extLst>
+                    </a:blip>
+                    <a:srcRect/>
+                    <a:stretch>
+                      <a:fillRect/>
+                    </a:stretch>
+                  </pic:blipFill>
+                  <pic:spPr bwMode="auto">
+                    <a:xfrm>
+                      <a:off x="0" y="0"/>
+                      <a:ext cx="5276215" cy="3899535"/>
+                    </a:xfrm>
+                    <a:prstGeom prst="rect">
+                      <a:avLst/>
+                    </a:prstGeom>
+                    <a:noFill/>
+                    <a:ln>
+                      <a:noFill/>
+                    </a:ln>
+                  </pic:spPr>
+                </pic:pic>
+              </a:graphicData>
+            </a:graphic>
+          </wp:inline>
+        </w:drawing>
+      </w:r>
+    </w:p>
+    <w:p>
+      <w:pPr>
+        <w:rPr>
+          <w:rStyle w:val="Strong"/>
+          <w:rFonts w:asciiTheme="minorHAnsi" w:eastAsia="Times New Roman" w:hAnsiTheme="minorHAnsi" w:cstheme="minorHAnsi"/>
+          <w:b w:val="0"/>
+          <w:bCs w:val="0"/>
+          <w:lang w:val="en-SG" w:eastAsia="zh-CN"/>
+        </w:rPr>
+      </w:pPr>
+    </w:p>
+    <w:p>
+      <w:pPr>
+        <w:pStyle w:val="Heading2"/>
+        <w:rPr>
+          <w:rStyle w:val="Strong"/>
+        </w:rPr>
+      </w:pPr>
+      <w:bookmarkStart w:id="4" w:name="_Toc157533347"/>
+      <w:r>
+        <w:rPr>
+          <w:rStyle w:val="Strong"/>
+        </w:rPr>
+        <w:t xml:space="preserve">2.1 </w:t>
+      </w:r>
+      <w:r>
+        <w:rPr>
+          <w:rStyle w:val="Strong"/>
+        </w:rPr>
+        <w:t>Data Privacy and Protection</w:t>
+      </w:r>
+      <w:bookmarkEnd w:id="4"/>
+    </w:p>
+    <w:p>
+      <w:pPr>
+        <w:rPr>
+          <w:rStyle w:val="Strong"/>
+          <w:rFonts w:asciiTheme="minorHAnsi" w:eastAsia="Times New Roman" w:hAnsiTheme="minorHAnsi" w:cstheme="minorHAnsi"/>
+          <w:b w:val="0"/>
+          <w:bCs w:val="0"/>
+          <w:lang w:val="en-SG" w:eastAsia="zh-CN"/>
+        </w:rPr>
+      </w:pPr>
+    </w:p>
+    <w:p>
+      <w:pPr>
+        <w:rPr>
+          <w:rStyle w:val="Strong"/>
+          <w:rFonts w:asciiTheme="minorHAnsi" w:eastAsia="Times New Roman" w:hAnsiTheme="minorHAnsi" w:cstheme="minorHAnsi"/>
+          <w:b w:val="0"/>
+          <w:bCs w:val="0"/>
+          <w:lang w:val="en-SG" w:eastAsia="zh-CN"/>
+        </w:rPr>
+      </w:pPr>
+      <w:r>
+        <w:rPr>
+          <w:rStyle w:val="Strong"/>
+          <w:rFonts w:asciiTheme="minorHAnsi" w:eastAsia="Times New Roman" w:hAnsiTheme="minorHAnsi" w:cstheme="minorHAnsi"/>
+          <w:b w:val="0"/>
+          <w:bCs w:val="0"/>
+          <w:lang w:val="en-SG" w:eastAsia="zh-CN"/>
+        </w:rPr>
+        <w:t>One of the most significant legal challenges for e-commerce sites involves data privacy and protection. E-commerce businesses collect vast amounts of personal data, such as names, addresses, and payment information. They must comply with regulations like the General Data Protection Regulation (GDPR) in the European Union and the California Consumer Privacy Act (CCPA) in the United States. These laws mandate strict guidelines on data collection, storage, and usage, including obtaining consent from users and providing them with control over their data (GDPR.eu, 2020).</w:t>
+      </w:r>
+    </w:p>
+    <w:p>
+      <w:pPr>
+        <w:rPr>
+          <w:rStyle w:val="Strong"/>
+          <w:rFonts w:asciiTheme="minorHAnsi" w:eastAsia="Times New Roman" w:hAnsiTheme="minorHAnsi" w:cstheme="minorHAnsi"/>
+          <w:b w:val="0"/>
+          <w:bCs w:val="0"/>
+          <w:lang w:val="en-SG" w:eastAsia="zh-CN"/>
+        </w:rPr>
+      </w:pPr>
+    </w:p>
+    <w:p>
+      <w:pPr>
+        <w:rPr>
+          <w:rStyle w:val="Strong"/>
+          <w:rFonts w:asciiTheme="minorHAnsi" w:eastAsia="Times New Roman" w:hAnsiTheme="minorHAnsi" w:cstheme="minorHAnsi"/>
+          <w:b w:val="0"/>
+          <w:bCs w:val="0"/>
+          <w:lang w:val="en-SG" w:eastAsia="zh-CN"/>
+        </w:rPr>
+      </w:pPr>
+    </w:p>
+    <w:p>
+      <w:pPr>
+        <w:pStyle w:val="Heading2"/>
+        <w:rPr>
+          <w:rStyle w:val="Strong"/>
+        </w:rPr>
+      </w:pPr>
+      <w:bookmarkStart w:id="5" w:name="_Toc157533348"/>
+      <w:r>
+        <w:rPr>
+          <w:rStyle w:val="Strong"/>
+        </w:rPr>
+        <w:t xml:space="preserve">2.2 </w:t>
+      </w:r>
+      <w:r>
+        <w:rPr>
+          <w:rStyle w:val="Strong"/>
+        </w:rPr>
+        <w:t>Intellectual Property Rights</w:t>
+      </w:r>
+      <w:bookmarkEnd w:id="5"/>
+    </w:p>
+    <w:p>
+      <w:pPr>
+        <w:rPr>
+          <w:rStyle w:val="Strong"/>
+          <w:rFonts w:asciiTheme="minorHAnsi" w:eastAsia="Times New Roman" w:hAnsiTheme="minorHAnsi" w:cstheme="minorHAnsi"/>
+          <w:b w:val="0"/>
+          <w:bCs w:val="0"/>
+          <w:lang w:val="en-SG" w:eastAsia="zh-CN"/>
+        </w:rPr>
+      </w:pPr>
+    </w:p>
+    <w:p>
+      <w:pPr>
+        <w:rPr>
+          <w:rStyle w:val="Strong"/>
+          <w:rFonts w:asciiTheme="minorHAnsi" w:eastAsia="Times New Roman" w:hAnsiTheme="minorHAnsi" w:cstheme="minorHAnsi"/>
+          <w:b w:val="0"/>
+          <w:bCs w:val="0"/>
+          <w:lang w:val="en-SG" w:eastAsia="zh-CN"/>
+        </w:rPr>
+      </w:pPr>
+      <w:r>
+        <w:rPr>
+          <w:rStyle w:val="Strong"/>
+          <w:rFonts w:asciiTheme="minorHAnsi" w:eastAsia="Times New Roman" w:hAnsiTheme="minorHAnsi" w:cstheme="minorHAnsi"/>
+          <w:b w:val="0"/>
+          <w:bCs w:val="0"/>
+          <w:lang w:val="en-SG" w:eastAsia="zh-CN"/>
+        </w:rPr>
+        <w:t>E-commerce platforms must also be vigilant about intellectual property rights. This involves ensuring that products sold on their website do not infringe upon patents, copyrights, or trademarks. Failure to monitor and address intellectual property infringement can lead to legal disputes and significant financial penalties (WIPO, 2021).</w:t>
+      </w:r>
+    </w:p>
+    <w:p>
+      <w:pPr>
+        <w:rPr>
+          <w:rStyle w:val="Strong"/>
+          <w:rFonts w:asciiTheme="minorHAnsi" w:eastAsia="Times New Roman" w:hAnsiTheme="minorHAnsi" w:cstheme="minorHAnsi"/>
+          <w:b w:val="0"/>
+          <w:bCs w:val="0"/>
+          <w:lang w:val="en-SG" w:eastAsia="zh-CN"/>
+        </w:rPr>
+      </w:pPr>
+    </w:p>
+    <w:p>
+      <w:pPr>
+        <w:pStyle w:val="Heading2"/>
+        <w:rPr>
+          <w:rStyle w:val="Strong"/>
+        </w:rPr>
+      </w:pPr>
+      <w:bookmarkStart w:id="6" w:name="_Toc157533349"/>
+      <w:r>
+        <w:rPr>
+          <w:rStyle w:val="Strong"/>
+        </w:rPr>
+        <w:t xml:space="preserve">2.3 </w:t>
+      </w:r>
+      <w:r>
+        <w:rPr>
+          <w:rStyle w:val="Strong"/>
+        </w:rPr>
+        <w:t>Consumer Protection Laws</w:t>
+      </w:r>
+      <w:bookmarkEnd w:id="6"/>
+    </w:p>
+    <w:p>
+      <w:pPr>
+        <w:rPr>
+          <w:rStyle w:val="Strong"/>
+          <w:rFonts w:asciiTheme="minorHAnsi" w:eastAsia="Times New Roman" w:hAnsiTheme="minorHAnsi" w:cstheme="minorHAnsi"/>
+          <w:b w:val="0"/>
+          <w:bCs w:val="0"/>
+          <w:lang w:val="en-SG" w:eastAsia="zh-CN"/>
+        </w:rPr>
+      </w:pPr>
+    </w:p>
+    <w:p>
+      <w:pPr>
+        <w:rPr>
+          <w:rStyle w:val="Strong"/>
+          <w:rFonts w:asciiTheme="minorHAnsi" w:eastAsia="Times New Roman" w:hAnsiTheme="minorHAnsi" w:cstheme="minorHAnsi"/>
+          <w:b w:val="0"/>
+          <w:bCs w:val="0"/>
+          <w:lang w:val="en-SG" w:eastAsia="zh-CN"/>
+        </w:rPr>
+      </w:pPr>
+      <w:r>
+        <w:rPr>
+          <w:rStyle w:val="Strong"/>
+          <w:rFonts w:asciiTheme="minorHAnsi" w:eastAsia="Times New Roman" w:hAnsiTheme="minorHAnsi" w:cstheme="minorHAnsi"/>
+          <w:b w:val="0"/>
+          <w:bCs w:val="0"/>
+          <w:lang w:val="en-SG" w:eastAsia="zh-CN"/>
+        </w:rPr>
+        <w:t>Consumer protection laws are another critical area. These laws, which vary by country, are designed to protect consumers from unfair business practices. They include regulations on product quality, advertising, and return policies. E-commerce sites must ensure that their practices comply with these laws to avoid legal consequences and maintain customer trust (FTC, 2022).</w:t>
+      </w:r>
+    </w:p>
+    <w:p>
+      <w:pPr>
+        <w:rPr>
+          <w:rStyle w:val="Strong"/>
+          <w:rFonts w:asciiTheme="minorHAnsi" w:eastAsia="Times New Roman" w:hAnsiTheme="minorHAnsi" w:cstheme="minorHAnsi"/>
+          <w:b w:val="0"/>
+          <w:bCs w:val="0"/>
+          <w:lang w:val="en-SG" w:eastAsia="zh-CN"/>
+        </w:rPr>
+      </w:pPr>
+    </w:p>
+    <w:p>
+      <w:pPr>
+        <w:pStyle w:val="Heading2"/>
+        <w:rPr>
+          <w:rStyle w:val="Strong"/>
+        </w:rPr>
+      </w:pPr>
+      <w:bookmarkStart w:id="7" w:name="_Toc157533350"/>
+      <w:r>
+        <w:rPr>
+          <w:rStyle w:val="Strong"/>
+        </w:rPr>
+        <w:t xml:space="preserve">2.4 </w:t>
+      </w:r>
+      <w:r>
+        <w:rPr>
+          <w:rStyle w:val="Strong"/>
+        </w:rPr>
+        <w:t>Solutions and Recommendations</w:t>
+      </w:r>
+      <w:bookmarkEnd w:id="7"/>
+    </w:p>
+    <w:p>
+      <w:pPr>
+        <w:rPr>
+          <w:rStyle w:val="Strong"/>
+          <w:rFonts w:asciiTheme="minorHAnsi" w:eastAsia="Times New Roman" w:hAnsiTheme="minorHAnsi" w:cstheme="minorHAnsi"/>
+          <w:b w:val="0"/>
+          <w:bCs w:val="0"/>
+          <w:lang w:val="en-SG" w:eastAsia="zh-CN"/>
+        </w:rPr>
+      </w:pPr>
+    </w:p>
+    <w:p>
+      <w:pPr>
+        <w:rPr>
+          <w:rStyle w:val="Strong"/>
+          <w:rFonts w:asciiTheme="minorHAnsi" w:eastAsia="Times New Roman" w:hAnsiTheme="minorHAnsi" w:cstheme="minorHAnsi"/>
+          <w:b w:val="0"/>
+          <w:bCs w:val="0"/>
+          <w:lang w:val="en-SG" w:eastAsia="zh-CN"/>
+        </w:rPr>
+      </w:pPr>
+      <w:r>
+        <w:rPr>
+          <w:rStyle w:val="Strong"/>
+          <w:rFonts w:asciiTheme="minorHAnsi" w:eastAsia="Times New Roman" w:hAnsiTheme="minorHAnsi" w:cstheme="minorHAnsi"/>
+          <w:b w:val="0"/>
+          <w:bCs w:val="0"/>
+          <w:lang w:val="en-SG" w:eastAsia="zh-CN"/>
+        </w:rPr>
+        <w:t xml:space="preserve">To address these issues, e-commerce websites should implement comprehensive data protection policies, regularly audit their product listings for potential intellectual property </w:t>
+      </w:r>
+      <w:r>
+        <w:rPr>
+          <w:rStyle w:val="Strong"/>
+          <w:rFonts w:asciiTheme="minorHAnsi" w:eastAsia="Times New Roman" w:hAnsiTheme="minorHAnsi" w:cstheme="minorHAnsi"/>
+          <w:b w:val="0"/>
+          <w:bCs w:val="0"/>
+          <w:lang w:val="en-SG" w:eastAsia="zh-CN"/>
+        </w:rPr>
+        <w:t>violations and</w:t>
+      </w:r>
+      <w:r>
+        <w:rPr>
+          <w:rStyle w:val="Strong"/>
+          <w:rFonts w:asciiTheme="minorHAnsi" w:eastAsia="Times New Roman" w:hAnsiTheme="minorHAnsi" w:cstheme="minorHAnsi"/>
+          <w:b w:val="0"/>
+          <w:bCs w:val="0"/>
+          <w:lang w:val="en-SG" w:eastAsia="zh-CN"/>
+        </w:rPr>
+        <w:t xml:space="preserve"> stay updated on consumer protection laws in different jurisdictions. Investing in legal expertise and technology solutions for compliance can be a proactive approach to mitigate these risks.</w:t>
+      </w:r>
+    </w:p>
+    <w:p>
+      <w:pPr>
+        <w:rPr>
+          <w:rStyle w:val="Strong"/>
+          <w:rFonts w:asciiTheme="minorHAnsi" w:eastAsia="Times New Roman" w:hAnsiTheme="minorHAnsi" w:cstheme="minorHAnsi"/>
+          <w:b w:val="0"/>
+          <w:bCs w:val="0"/>
+          <w:lang w:val="en-SG" w:eastAsia="zh-CN"/>
+        </w:rPr>
+      </w:pPr>
     </w:p>
     <w:p>
       <w:pPr>
@@ -2906,6 +3627,16 @@
           <w:lang w:val="en-SG"/>
         </w:rPr>
       </w:pPr>
+      <w:r>
+        <w:rPr>
+          <w:rStyle w:val="Strong"/>
+          <w:rFonts w:asciiTheme="minorHAnsi" w:eastAsia="Times New Roman" w:hAnsiTheme="minorHAnsi" w:cstheme="minorHAnsi"/>
+          <w:b w:val="0"/>
+          <w:bCs w:val="0"/>
+          <w:lang w:val="en-SG" w:eastAsia="zh-CN"/>
+        </w:rPr>
+        <w:t>In conclusion, e-commerce websites face significant legal challenges in data privacy, intellectual property rights, and consumer protection. Addressing these issues effectively requires a combination of legal knowledge, technology, and a commitment to ethical business practices.</w:t>
+      </w:r>
     </w:p>
     <w:p>
       <w:pPr>
@@ -2931,6 +3662,7 @@
           <w:lang w:val="en-SG" w:eastAsia="zh-CN"/>
         </w:rPr>
       </w:pPr>
+      <w:bookmarkStart w:id="8" w:name="_Toc157533351"/>
       <w:r>
         <w:rPr>
           <w:rFonts w:asciiTheme="majorHAnsi" w:hAnsiTheme="majorHAnsi" w:cstheme="majorHAnsi"/>
@@ -2939,6 +3671,7 @@
         <w:lastRenderedPageBreak/>
         <w:t>3. Personalization Service to the Shoppers</w:t>
       </w:r>
+      <w:bookmarkEnd w:id="8"/>
     </w:p>
     <w:p>
       <w:pPr>
@@ -3063,9 +3796,283 @@
         </w:rPr>
       </w:pPr>
     </w:p>
+    <w:p>
+      <w:pPr>
+        <w:rPr>
+          <w:lang w:val="en-SG"/>
+        </w:rPr>
+      </w:pPr>
+    </w:p>
+    <w:p>
+      <w:pPr>
+        <w:rPr>
+          <w:lang w:val="en-SG"/>
+        </w:rPr>
+      </w:pPr>
+    </w:p>
+    <w:p>
+      <w:pPr>
+        <w:rPr>
+          <w:lang w:val="en-SG"/>
+        </w:rPr>
+      </w:pPr>
+    </w:p>
+    <w:p>
+      <w:pPr>
+        <w:rPr>
+          <w:lang w:val="en-SG"/>
+        </w:rPr>
+      </w:pPr>
+    </w:p>
+    <w:p>
+      <w:pPr>
+        <w:rPr>
+          <w:lang w:val="en-SG"/>
+        </w:rPr>
+      </w:pPr>
+    </w:p>
+    <w:p>
+      <w:pPr>
+        <w:rPr>
+          <w:lang w:val="en-SG"/>
+        </w:rPr>
+      </w:pPr>
+    </w:p>
+    <w:p>
+      <w:pPr>
+        <w:rPr>
+          <w:lang w:val="en-SG"/>
+        </w:rPr>
+      </w:pPr>
+    </w:p>
+    <w:p>
+      <w:pPr>
+        <w:rPr>
+          <w:lang w:val="en-SG"/>
+        </w:rPr>
+      </w:pPr>
+    </w:p>
+    <w:p>
+      <w:pPr>
+        <w:rPr>
+          <w:lang w:val="en-SG"/>
+        </w:rPr>
+      </w:pPr>
+    </w:p>
+    <w:p>
+      <w:pPr>
+        <w:rPr>
+          <w:lang w:val="en-SG"/>
+        </w:rPr>
+      </w:pPr>
+    </w:p>
+    <w:p>
+      <w:pPr>
+        <w:rPr>
+          <w:lang w:val="en-SG"/>
+        </w:rPr>
+      </w:pPr>
+    </w:p>
+    <w:p>
+      <w:pPr>
+        <w:rPr>
+          <w:lang w:val="en-SG"/>
+        </w:rPr>
+      </w:pPr>
+    </w:p>
+    <w:p>
+      <w:pPr>
+        <w:rPr>
+          <w:lang w:val="en-SG"/>
+        </w:rPr>
+      </w:pPr>
+    </w:p>
+    <w:p>
+      <w:pPr>
+        <w:rPr>
+          <w:lang w:val="en-SG"/>
+        </w:rPr>
+      </w:pPr>
+    </w:p>
+    <w:p>
+      <w:pPr>
+        <w:rPr>
+          <w:lang w:val="en-SG"/>
+        </w:rPr>
+      </w:pPr>
+    </w:p>
+    <w:p>
+      <w:pPr>
+        <w:rPr>
+          <w:lang w:val="en-SG"/>
+        </w:rPr>
+      </w:pPr>
+    </w:p>
+    <w:p>
+      <w:pPr>
+        <w:rPr>
+          <w:lang w:val="en-SG"/>
+        </w:rPr>
+      </w:pPr>
+    </w:p>
+    <w:p>
+      <w:pPr>
+        <w:rPr>
+          <w:lang w:val="en-SG"/>
+        </w:rPr>
+      </w:pPr>
+    </w:p>
+    <w:p>
+      <w:pPr>
+        <w:rPr>
+          <w:lang w:val="en-SG"/>
+        </w:rPr>
+      </w:pPr>
+    </w:p>
+    <w:p>
+      <w:pPr>
+        <w:rPr>
+          <w:lang w:val="en-SG"/>
+        </w:rPr>
+      </w:pPr>
+    </w:p>
+    <w:p>
+      <w:pPr>
+        <w:rPr>
+          <w:lang w:val="en-SG"/>
+        </w:rPr>
+      </w:pPr>
+    </w:p>
+    <w:p>
+      <w:pPr>
+        <w:rPr>
+          <w:lang w:val="en-SG"/>
+        </w:rPr>
+      </w:pPr>
+    </w:p>
+    <w:p>
+      <w:pPr>
+        <w:rPr>
+          <w:lang w:val="en-SG"/>
+        </w:rPr>
+      </w:pPr>
+    </w:p>
+    <w:p>
+      <w:pPr>
+        <w:rPr>
+          <w:lang w:val="en-SG"/>
+        </w:rPr>
+      </w:pPr>
+    </w:p>
+    <w:p>
+      <w:pPr>
+        <w:pStyle w:val="Heading1"/>
+        <w:rPr>
+          <w:rFonts w:asciiTheme="majorHAnsi" w:hAnsiTheme="majorHAnsi" w:cstheme="majorHAnsi"/>
+          <w:color w:val="4472C4" w:themeColor="accent1"/>
+        </w:rPr>
+      </w:pPr>
+      <w:bookmarkStart w:id="9" w:name="_Toc157533352"/>
+      <w:r>
+        <w:rPr>
+          <w:rFonts w:asciiTheme="majorHAnsi" w:hAnsiTheme="majorHAnsi" w:cstheme="majorHAnsi"/>
+          <w:color w:val="4472C4" w:themeColor="accent1"/>
+        </w:rPr>
+        <w:lastRenderedPageBreak/>
+        <w:t>4</w:t>
+      </w:r>
+      <w:r>
+        <w:rPr>
+          <w:rFonts w:asciiTheme="majorHAnsi" w:hAnsiTheme="majorHAnsi" w:cstheme="majorHAnsi"/>
+          <w:color w:val="4472C4" w:themeColor="accent1"/>
+        </w:rPr>
+        <w:t xml:space="preserve">. </w:t>
+      </w:r>
+      <w:r>
+        <w:rPr>
+          <w:rFonts w:asciiTheme="majorHAnsi" w:hAnsiTheme="majorHAnsi" w:cstheme="majorHAnsi"/>
+          <w:color w:val="4472C4" w:themeColor="accent1"/>
+        </w:rPr>
+        <w:t>References</w:t>
+      </w:r>
+      <w:bookmarkEnd w:id="9"/>
+    </w:p>
+    <w:p>
+      <w:pPr>
+        <w:rPr>
+          <w:lang w:val="en-GB"/>
+        </w:rPr>
+      </w:pPr>
+    </w:p>
+    <w:p>
+      <w:pPr>
+        <w:pStyle w:val="ListParagraph"/>
+        <w:numPr>
+          <w:ilvl w:val="0"/>
+          <w:numId w:val="8"/>
+        </w:numPr>
+        <w:rPr>
+          <w:lang w:val="en-GB"/>
+        </w:rPr>
+      </w:pPr>
+    </w:p>
+    <w:p>
+      <w:pPr>
+        <w:pStyle w:val="ListParagraph"/>
+        <w:numPr>
+          <w:ilvl w:val="0"/>
+          <w:numId w:val="8"/>
+        </w:numPr>
+        <w:rPr>
+          <w:lang w:val="en-GB"/>
+        </w:rPr>
+      </w:pPr>
+      <w:r>
+        <w:rPr>
+          <w:lang w:val="en-GB"/>
+        </w:rPr>
+        <w:t>GDPR.eu. (2020). General Data Protection Regulation (GDPR) Compliance Guidelines.</w:t>
+      </w:r>
+    </w:p>
+    <w:p>
+      <w:pPr>
+        <w:pStyle w:val="ListParagraph"/>
+        <w:numPr>
+          <w:ilvl w:val="0"/>
+          <w:numId w:val="8"/>
+        </w:numPr>
+        <w:rPr>
+          <w:lang w:val="en-GB"/>
+        </w:rPr>
+      </w:pPr>
+      <w:r>
+        <w:rPr>
+          <w:lang w:val="en-GB"/>
+        </w:rPr>
+        <w:t>World Intellectual Property Organization (WIPO). (2021). Intellectual Property and E-commerce: How to Take Care of Your Business’ IP.</w:t>
+      </w:r>
+    </w:p>
+    <w:p>
+      <w:pPr>
+        <w:pStyle w:val="ListParagraph"/>
+        <w:numPr>
+          <w:ilvl w:val="0"/>
+          <w:numId w:val="8"/>
+        </w:numPr>
+        <w:rPr>
+          <w:lang w:val="en-SG"/>
+        </w:rPr>
+      </w:pPr>
+      <w:r>
+        <w:rPr>
+          <w:lang w:val="en-GB"/>
+        </w:rPr>
+        <w:t>Federal Trade Commission (FTC). (2022). Consumer Protection Principles for E-commerce.</w:t>
+      </w:r>
+    </w:p>
     <w:sectPr>
-      <w:headerReference w:type="default" r:id="rId11"/>
-      <w:footerReference w:type="default" r:id="rId12"/>
+      <w:headerReference w:type="default" r:id="rId12"/>
+      <w:footerReference w:type="default" r:id="rId13"/>
       <w:pgSz w:w="11909" w:h="16834" w:code="9"/>
       <w:pgMar w:top="864" w:right="1800" w:bottom="864" w:left="1800" w:header="720" w:footer="720" w:gutter="0"/>
       <w:cols w:space="720"/>
@@ -3555,6 +4562,95 @@
     </w:lvl>
   </w:abstractNum>
   <w:abstractNum w:abstractNumId="2" w15:restartNumberingAfterBreak="0">
+    <w:nsid w:val="0BA72B4B"/>
+    <w:multiLevelType w:val="hybridMultilevel"/>
+    <w:tmpl w:val="3ADEB8BC"/>
+    <w:lvl w:ilvl="0" w:tplc="4809000F">
+      <w:start w:val="1"/>
+      <w:numFmt w:val="decimal"/>
+      <w:lvlText w:val="%1."/>
+      <w:lvlJc w:val="left"/>
+      <w:pPr>
+        <w:ind w:left="720" w:hanging="360"/>
+      </w:pPr>
+      <w:rPr>
+        <w:rFonts w:hint="default"/>
+      </w:rPr>
+    </w:lvl>
+    <w:lvl w:ilvl="1" w:tplc="48090019" w:tentative="1">
+      <w:start w:val="1"/>
+      <w:numFmt w:val="lowerLetter"/>
+      <w:lvlText w:val="%2."/>
+      <w:lvlJc w:val="left"/>
+      <w:pPr>
+        <w:ind w:left="1440" w:hanging="360"/>
+      </w:pPr>
+    </w:lvl>
+    <w:lvl w:ilvl="2" w:tplc="4809001B" w:tentative="1">
+      <w:start w:val="1"/>
+      <w:numFmt w:val="lowerRoman"/>
+      <w:lvlText w:val="%3."/>
+      <w:lvlJc w:val="right"/>
+      <w:pPr>
+        <w:ind w:left="2160" w:hanging="180"/>
+      </w:pPr>
+    </w:lvl>
+    <w:lvl w:ilvl="3" w:tplc="4809000F" w:tentative="1">
+      <w:start w:val="1"/>
+      <w:numFmt w:val="decimal"/>
+      <w:lvlText w:val="%4."/>
+      <w:lvlJc w:val="left"/>
+      <w:pPr>
+        <w:ind w:left="2880" w:hanging="360"/>
+      </w:pPr>
+    </w:lvl>
+    <w:lvl w:ilvl="4" w:tplc="48090019" w:tentative="1">
+      <w:start w:val="1"/>
+      <w:numFmt w:val="lowerLetter"/>
+      <w:lvlText w:val="%5."/>
+      <w:lvlJc w:val="left"/>
+      <w:pPr>
+        <w:ind w:left="3600" w:hanging="360"/>
+      </w:pPr>
+    </w:lvl>
+    <w:lvl w:ilvl="5" w:tplc="4809001B" w:tentative="1">
+      <w:start w:val="1"/>
+      <w:numFmt w:val="lowerRoman"/>
+      <w:lvlText w:val="%6."/>
+      <w:lvlJc w:val="right"/>
+      <w:pPr>
+        <w:ind w:left="4320" w:hanging="180"/>
+      </w:pPr>
+    </w:lvl>
+    <w:lvl w:ilvl="6" w:tplc="4809000F" w:tentative="1">
+      <w:start w:val="1"/>
+      <w:numFmt w:val="decimal"/>
+      <w:lvlText w:val="%7."/>
+      <w:lvlJc w:val="left"/>
+      <w:pPr>
+        <w:ind w:left="5040" w:hanging="360"/>
+      </w:pPr>
+    </w:lvl>
+    <w:lvl w:ilvl="7" w:tplc="48090019" w:tentative="1">
+      <w:start w:val="1"/>
+      <w:numFmt w:val="lowerLetter"/>
+      <w:lvlText w:val="%8."/>
+      <w:lvlJc w:val="left"/>
+      <w:pPr>
+        <w:ind w:left="5760" w:hanging="360"/>
+      </w:pPr>
+    </w:lvl>
+    <w:lvl w:ilvl="8" w:tplc="4809001B" w:tentative="1">
+      <w:start w:val="1"/>
+      <w:numFmt w:val="lowerRoman"/>
+      <w:lvlText w:val="%9."/>
+      <w:lvlJc w:val="right"/>
+      <w:pPr>
+        <w:ind w:left="6480" w:hanging="180"/>
+      </w:pPr>
+    </w:lvl>
+  </w:abstractNum>
+  <w:abstractNum w:abstractNumId="3" w15:restartNumberingAfterBreak="0">
     <w:nsid w:val="29AF5F2C"/>
     <w:multiLevelType w:val="hybridMultilevel"/>
     <w:tmpl w:val="37147828"/>
@@ -3667,7 +4763,7 @@
       </w:rPr>
     </w:lvl>
   </w:abstractNum>
-  <w:abstractNum w:abstractNumId="3" w15:restartNumberingAfterBreak="0">
+  <w:abstractNum w:abstractNumId="4" w15:restartNumberingAfterBreak="0">
     <w:nsid w:val="2F85302A"/>
     <w:multiLevelType w:val="hybridMultilevel"/>
     <w:tmpl w:val="F908381E"/>
@@ -3780,7 +4876,7 @@
       </w:rPr>
     </w:lvl>
   </w:abstractNum>
-  <w:abstractNum w:abstractNumId="4" w15:restartNumberingAfterBreak="0">
+  <w:abstractNum w:abstractNumId="5" w15:restartNumberingAfterBreak="0">
     <w:nsid w:val="3A8C5A5C"/>
     <w:multiLevelType w:val="hybridMultilevel"/>
     <w:tmpl w:val="A7946524"/>
@@ -3866,7 +4962,7 @@
       </w:pPr>
     </w:lvl>
   </w:abstractNum>
-  <w:abstractNum w:abstractNumId="5" w15:restartNumberingAfterBreak="0">
+  <w:abstractNum w:abstractNumId="6" w15:restartNumberingAfterBreak="0">
     <w:nsid w:val="790623F4"/>
     <w:multiLevelType w:val="multilevel"/>
     <w:tmpl w:val="F2E8492C"/>
@@ -4015,7 +5111,7 @@
       </w:rPr>
     </w:lvl>
   </w:abstractNum>
-  <w:abstractNum w:abstractNumId="6" w15:restartNumberingAfterBreak="0">
+  <w:abstractNum w:abstractNumId="7" w15:restartNumberingAfterBreak="0">
     <w:nsid w:val="79824B0B"/>
     <w:multiLevelType w:val="multilevel"/>
     <w:tmpl w:val="538EBE9E"/>
@@ -4165,24 +5261,27 @@
     </w:lvl>
   </w:abstractNum>
   <w:num w:numId="1" w16cid:durableId="469787586">
-    <w:abstractNumId w:val="4"/>
+    <w:abstractNumId w:val="5"/>
   </w:num>
   <w:num w:numId="2" w16cid:durableId="2045980542">
-    <w:abstractNumId w:val="3"/>
+    <w:abstractNumId w:val="4"/>
   </w:num>
   <w:num w:numId="3" w16cid:durableId="329800419">
     <w:abstractNumId w:val="0"/>
   </w:num>
   <w:num w:numId="4" w16cid:durableId="1321696457">
-    <w:abstractNumId w:val="5"/>
+    <w:abstractNumId w:val="6"/>
   </w:num>
   <w:num w:numId="5" w16cid:durableId="758251623">
-    <w:abstractNumId w:val="6"/>
+    <w:abstractNumId w:val="7"/>
   </w:num>
   <w:num w:numId="6" w16cid:durableId="945579861">
     <w:abstractNumId w:val="1"/>
   </w:num>
   <w:num w:numId="7" w16cid:durableId="588193988">
+    <w:abstractNumId w:val="3"/>
+  </w:num>
+  <w:num w:numId="8" w16cid:durableId="1986927237">
     <w:abstractNumId w:val="2"/>
   </w:num>
 </w:numbering>
@@ -4193,7 +5292,7 @@
   <w:docDefaults>
     <w:rPrDefault>
       <w:rPr>
-        <w:rFonts w:ascii="Times New Roman" w:eastAsia="宋体" w:hAnsi="Times New Roman" w:cs="Times New Roman"/>
+        <w:rFonts w:ascii="Times New Roman" w:eastAsia="SimSun" w:hAnsi="Times New Roman" w:cs="Times New Roman"/>
         <w:lang w:val="en-GB" w:eastAsia="zh-CN" w:bidi="ar-SA"/>
       </w:rPr>
     </w:rPrDefault>
@@ -4612,13 +5711,14 @@
     <w:name w:val="heading 2"/>
     <w:next w:val="Normal"/>
     <w:qFormat/>
-    <w:rsid w:val="008B5320"/>
+    <w:rsid w:val="002F4A15"/>
     <w:pPr>
       <w:outlineLvl w:val="1"/>
     </w:pPr>
     <w:rPr>
+      <w:rFonts w:asciiTheme="minorHAnsi" w:eastAsia="Times New Roman" w:hAnsiTheme="minorHAnsi" w:cstheme="minorHAnsi"/>
       <w:sz w:val="24"/>
-      <w:lang w:val="en-US" w:eastAsia="en-US"/>
+      <w:lang w:val="en-SG"/>
     </w:rPr>
   </w:style>
   <w:style w:type="paragraph" w:styleId="Heading3">
@@ -4674,7 +5774,7 @@
     <w:link w:val="Heading1"/>
     <w:rsid w:val="004B412E"/>
     <w:rPr>
-      <w:rFonts w:ascii="Cambria" w:eastAsia="宋体" w:hAnsi="Cambria"/>
+      <w:rFonts w:ascii="Cambria" w:eastAsia="SimSun" w:hAnsi="Cambria"/>
       <w:b/>
       <w:bCs/>
       <w:kern w:val="32"/>

</xml_diff>